<commit_message>
Reorganize project under Coding directory
Co-authored-by: arena-agent <297053741+arena-agent@users.noreply.github.com>
</commit_message>
<xml_diff>
--- a/docs/additional-documentation/ComicCraft_Project_Documentation.docx
+++ b/docs/additional-documentation/ComicCraft_Project_Documentation.docx
@@ -28999,7 +28999,7 @@
         <w:pStyle w:val="Heading2"/>
       </w:pPr>
       <w:r>
-        <w:t xml:space="preserve">30. Demo Video Link</w:t>
+        <w:t xml:space="preserve">30. Demonstration Materials</w:t>
       </w:r>
     </w:p>
     <w:p>
@@ -29007,7 +29007,7 @@
         <w:pStyle w:val="FirstParagraph"/>
       </w:pPr>
       <w:r>
-        <w:t xml:space="preserve">Demo video link will be added after the final project demonstration.</w:t>
+        <w:t xml:space="preserve">Demonstration media is not included in this repository. The README describes the application workflow and the steps for running it locally.</w:t>
       </w:r>
     </w:p>
     <w:p>

</xml_diff>